<commit_message>
Põe as funcionalidades em primeiro plano, como pede o enunciado
O trabalho pede foco nas funcionalidades e recursos acrescentados ao longo
do tempo. Cada marco passa a declarar as capacidades que introduziu, e um
segundo diagrama mostra quando cada uma estreou e quais sistemas a trouxeram,
no mesmo eixo de anos do diagrama de linhagens.

BSD, GNU, Minix e Linux foram reescritos: descreviam licença e finalidade,
agora descrevem recursos — sockets e TCP/IP, ferramentas portáveis,
microkernel com serviços fora do núcleo, multitarefa preemptiva e módulos
carregáveis.

O editor ganhou as caixas de recursos e o docx foi regerado com as descrições
novas e a lista de recursos de cada marco.

Co-Authored-By: Claude Opus 5 (1M context) <noreply@anthropic.com>
Claude-Session: https://claude.ai/code/session_016UZrfZ9osCmxrURoBUmkm8
</commit_message>
<xml_diff>
--- a/Linha do Tempo SO.docx
+++ b/Linha do Tempo SO.docx
@@ -36,6 +36,35 @@
     </w:p>
     <w:p>
       <w:pPr>
+        <w:spacing w:before="0" w:beforeAutospacing="off" w:after="240" w:afterAutospacing="off"/>
+      </w:pPr>
+      <w:r>
+        <w:rPr>
+          <w:rFonts w:ascii="Aptos" w:hAnsi="Aptos" w:eastAsia="Aptos" w:cs="Aptos"/>
+          <w:b w:val="1"/>
+          <w:bCs w:val="1"/>
+          <w:noProof w:val="0"/>
+          <w:sz w:val="24"/>
+          <w:szCs w:val="24"/>
+          <w:lang w:val="pt-BR"/>
+        </w:rPr>
+        <w:t xml:space="preserve">Recursos: </w:t>
+      </w:r>
+      <w:r>
+        <w:rPr>
+          <w:rFonts w:ascii="Aptos" w:hAnsi="Aptos" w:eastAsia="Aptos" w:cs="Aptos"/>
+          <w:i w:val="1"/>
+          <w:iCs w:val="1"/>
+          <w:noProof w:val="0"/>
+          <w:sz w:val="24"/>
+          <w:szCs w:val="24"/>
+          <w:lang w:val="pt-BR"/>
+        </w:rPr>
+        <w:t xml:space="preserve">Processamento em lote</w:t>
+      </w:r>
+    </w:p>
+    <w:p>
+      <w:pPr>
         <w:spacing w:before="240" w:beforeAutospacing="off" w:after="240" w:afterAutospacing="off"/>
       </w:pPr>
       <w:r>
@@ -90,6 +119,35 @@
     </w:p>
     <w:p>
       <w:pPr>
+        <w:spacing w:before="0" w:beforeAutospacing="off" w:after="240" w:afterAutospacing="off"/>
+      </w:pPr>
+      <w:r>
+        <w:rPr>
+          <w:rFonts w:ascii="Aptos" w:hAnsi="Aptos" w:eastAsia="Aptos" w:cs="Aptos"/>
+          <w:b w:val="1"/>
+          <w:bCs w:val="1"/>
+          <w:noProof w:val="0"/>
+          <w:sz w:val="24"/>
+          <w:szCs w:val="24"/>
+          <w:lang w:val="pt-BR"/>
+        </w:rPr>
+        <w:t xml:space="preserve">Recursos: </w:t>
+      </w:r>
+      <w:r>
+        <w:rPr>
+          <w:rFonts w:ascii="Aptos" w:hAnsi="Aptos" w:eastAsia="Aptos" w:cs="Aptos"/>
+          <w:i w:val="1"/>
+          <w:iCs w:val="1"/>
+          <w:noProof w:val="0"/>
+          <w:sz w:val="24"/>
+          <w:szCs w:val="24"/>
+          <w:lang w:val="pt-BR"/>
+        </w:rPr>
+        <w:t xml:space="preserve">Tempo compartilhado</w:t>
+      </w:r>
+    </w:p>
+    <w:p>
+      <w:pPr>
         <w:spacing w:before="240" w:beforeAutospacing="off" w:after="240" w:afterAutospacing="off"/>
       </w:pPr>
       <w:r>
@@ -122,6 +180,35 @@
     </w:p>
     <w:p>
       <w:pPr>
+        <w:spacing w:before="0" w:beforeAutospacing="off" w:after="240" w:afterAutospacing="off"/>
+      </w:pPr>
+      <w:r>
+        <w:rPr>
+          <w:rFonts w:ascii="Aptos" w:hAnsi="Aptos" w:eastAsia="Aptos" w:cs="Aptos"/>
+          <w:b w:val="1"/>
+          <w:bCs w:val="1"/>
+          <w:noProof w:val="0"/>
+          <w:sz w:val="24"/>
+          <w:szCs w:val="24"/>
+          <w:lang w:val="pt-BR"/>
+        </w:rPr>
+        <w:t xml:space="preserve">Recursos: </w:t>
+      </w:r>
+      <w:r>
+        <w:rPr>
+          <w:rFonts w:ascii="Aptos" w:hAnsi="Aptos" w:eastAsia="Aptos" w:cs="Aptos"/>
+          <w:i w:val="1"/>
+          <w:iCs w:val="1"/>
+          <w:noProof w:val="0"/>
+          <w:sz w:val="24"/>
+          <w:szCs w:val="24"/>
+          <w:lang w:val="pt-BR"/>
+        </w:rPr>
+        <w:t xml:space="preserve">Memória virtual</w:t>
+      </w:r>
+    </w:p>
+    <w:p>
+      <w:pPr>
         <w:spacing w:before="240" w:beforeAutospacing="off" w:after="240" w:afterAutospacing="off"/>
       </w:pPr>
       <w:r>
@@ -154,6 +241,35 @@
     </w:p>
     <w:p>
       <w:pPr>
+        <w:spacing w:before="0" w:beforeAutospacing="off" w:after="240" w:afterAutospacing="off"/>
+      </w:pPr>
+      <w:r>
+        <w:rPr>
+          <w:rFonts w:ascii="Aptos" w:hAnsi="Aptos" w:eastAsia="Aptos" w:cs="Aptos"/>
+          <w:b w:val="1"/>
+          <w:bCs w:val="1"/>
+          <w:noProof w:val="0"/>
+          <w:sz w:val="24"/>
+          <w:szCs w:val="24"/>
+          <w:lang w:val="pt-BR"/>
+        </w:rPr>
+        <w:t xml:space="preserve">Recursos: </w:t>
+      </w:r>
+      <w:r>
+        <w:rPr>
+          <w:rFonts w:ascii="Aptos" w:hAnsi="Aptos" w:eastAsia="Aptos" w:cs="Aptos"/>
+          <w:i w:val="1"/>
+          <w:iCs w:val="1"/>
+          <w:noProof w:val="0"/>
+          <w:sz w:val="24"/>
+          <w:szCs w:val="24"/>
+          <w:lang w:val="pt-BR"/>
+        </w:rPr>
+        <w:t xml:space="preserve">Multiprogramação</w:t>
+      </w:r>
+    </w:p>
+    <w:p>
+      <w:pPr>
         <w:spacing w:before="240" w:beforeAutospacing="off" w:after="240" w:afterAutospacing="off"/>
       </w:pPr>
       <w:r>
@@ -186,6 +302,35 @@
     </w:p>
     <w:p>
       <w:pPr>
+        <w:spacing w:before="0" w:beforeAutospacing="off" w:after="240" w:afterAutospacing="off"/>
+      </w:pPr>
+      <w:r>
+        <w:rPr>
+          <w:rFonts w:ascii="Aptos" w:hAnsi="Aptos" w:eastAsia="Aptos" w:cs="Aptos"/>
+          <w:b w:val="1"/>
+          <w:bCs w:val="1"/>
+          <w:noProof w:val="0"/>
+          <w:sz w:val="24"/>
+          <w:szCs w:val="24"/>
+          <w:lang w:val="pt-BR"/>
+        </w:rPr>
+        <w:t xml:space="preserve">Recursos: </w:t>
+      </w:r>
+      <w:r>
+        <w:rPr>
+          <w:rFonts w:ascii="Aptos" w:hAnsi="Aptos" w:eastAsia="Aptos" w:cs="Aptos"/>
+          <w:i w:val="1"/>
+          <w:iCs w:val="1"/>
+          <w:noProof w:val="0"/>
+          <w:sz w:val="24"/>
+          <w:szCs w:val="24"/>
+          <w:lang w:val="pt-BR"/>
+        </w:rPr>
+        <w:t xml:space="preserve">Proteção de memória, Arquivos hierárquicos, Memória virtual, Tempo compartilhado</w:t>
+      </w:r>
+    </w:p>
+    <w:p>
+      <w:pPr>
         <w:spacing w:before="240" w:beforeAutospacing="off" w:after="240" w:afterAutospacing="off"/>
       </w:pPr>
       <w:r>
@@ -240,6 +385,35 @@
     </w:p>
     <w:p>
       <w:pPr>
+        <w:spacing w:before="0" w:beforeAutospacing="off" w:after="240" w:afterAutospacing="off"/>
+      </w:pPr>
+      <w:r>
+        <w:rPr>
+          <w:rFonts w:ascii="Aptos" w:hAnsi="Aptos" w:eastAsia="Aptos" w:cs="Aptos"/>
+          <w:b w:val="1"/>
+          <w:bCs w:val="1"/>
+          <w:noProof w:val="0"/>
+          <w:sz w:val="24"/>
+          <w:szCs w:val="24"/>
+          <w:lang w:val="pt-BR"/>
+        </w:rPr>
+        <w:t xml:space="preserve">Recursos: </w:t>
+      </w:r>
+      <w:r>
+        <w:rPr>
+          <w:rFonts w:ascii="Aptos" w:hAnsi="Aptos" w:eastAsia="Aptos" w:cs="Aptos"/>
+          <w:i w:val="1"/>
+          <w:iCs w:val="1"/>
+          <w:noProof w:val="0"/>
+          <w:sz w:val="24"/>
+          <w:szCs w:val="24"/>
+          <w:lang w:val="pt-BR"/>
+        </w:rPr>
+        <w:t xml:space="preserve">Linha de comando, Arquivos hierárquicos, Multiprogramação, Tempo compartilhado</w:t>
+      </w:r>
+    </w:p>
+    <w:p>
+      <w:pPr>
         <w:spacing w:before="240" w:beforeAutospacing="off" w:after="240" w:afterAutospacing="off"/>
       </w:pPr>
       <w:r>
@@ -272,6 +446,35 @@
     </w:p>
     <w:p>
       <w:pPr>
+        <w:spacing w:before="0" w:beforeAutospacing="off" w:after="240" w:afterAutospacing="off"/>
+      </w:pPr>
+      <w:r>
+        <w:rPr>
+          <w:rFonts w:ascii="Aptos" w:hAnsi="Aptos" w:eastAsia="Aptos" w:cs="Aptos"/>
+          <w:b w:val="1"/>
+          <w:bCs w:val="1"/>
+          <w:noProof w:val="0"/>
+          <w:sz w:val="24"/>
+          <w:szCs w:val="24"/>
+          <w:lang w:val="pt-BR"/>
+        </w:rPr>
+        <w:t xml:space="preserve">Recursos: </w:t>
+      </w:r>
+      <w:r>
+        <w:rPr>
+          <w:rFonts w:ascii="Aptos" w:hAnsi="Aptos" w:eastAsia="Aptos" w:cs="Aptos"/>
+          <w:i w:val="1"/>
+          <w:iCs w:val="1"/>
+          <w:noProof w:val="0"/>
+          <w:sz w:val="24"/>
+          <w:szCs w:val="24"/>
+          <w:lang w:val="pt-BR"/>
+        </w:rPr>
+        <w:t xml:space="preserve">Portabilidade</w:t>
+      </w:r>
+    </w:p>
+    <w:p>
+      <w:pPr>
         <w:spacing w:before="240" w:beforeAutospacing="off" w:after="240" w:afterAutospacing="off"/>
       </w:pPr>
       <w:r>
@@ -304,6 +507,35 @@
     </w:p>
     <w:p>
       <w:pPr>
+        <w:spacing w:before="0" w:beforeAutospacing="off" w:after="240" w:afterAutospacing="off"/>
+      </w:pPr>
+      <w:r>
+        <w:rPr>
+          <w:rFonts w:ascii="Aptos" w:hAnsi="Aptos" w:eastAsia="Aptos" w:cs="Aptos"/>
+          <w:b w:val="1"/>
+          <w:bCs w:val="1"/>
+          <w:noProof w:val="0"/>
+          <w:sz w:val="24"/>
+          <w:szCs w:val="24"/>
+          <w:lang w:val="pt-BR"/>
+        </w:rPr>
+        <w:t xml:space="preserve">Recursos: </w:t>
+      </w:r>
+      <w:r>
+        <w:rPr>
+          <w:rFonts w:ascii="Aptos" w:hAnsi="Aptos" w:eastAsia="Aptos" w:cs="Aptos"/>
+          <w:i w:val="1"/>
+          <w:iCs w:val="1"/>
+          <w:noProof w:val="0"/>
+          <w:sz w:val="24"/>
+          <w:szCs w:val="24"/>
+          <w:lang w:val="pt-BR"/>
+        </w:rPr>
+        <w:t xml:space="preserve">Linha de comando, Arquivos hierárquicos</w:t>
+      </w:r>
+    </w:p>
+    <w:p>
+      <w:pPr>
         <w:spacing w:before="240" w:beforeAutospacing="off" w:after="240" w:afterAutospacing="off"/>
       </w:pPr>
       <w:r>
@@ -353,7 +585,58 @@
           <w:szCs w:val="24"/>
           <w:lang w:val="pt-BR"/>
         </w:rPr>
-        <w:t xml:space="preserve"> (BSD), uma evolução do UNIX desenvolvida na Universidade da Califórnia, Berkeley. O projeto incorporou melhorias ao UNIX e teve grande influência no desenvolvimento posterior de sistemas baseados nessa família.</w:t>
+        <w:t xml:space="preserve"> (BSD), evolução do UNIX feita na Universidade da Califórnia, Berkeley. Acrescentou a pilha de rede TCP/IP e a interface de </w:t>
+      </w:r>
+      <w:r>
+        <w:rPr>
+          <w:rFonts w:ascii="Aptos" w:hAnsi="Aptos" w:eastAsia="Aptos" w:cs="Aptos"/>
+          <w:i w:val="1"/>
+          <w:iCs w:val="1"/>
+          <w:noProof w:val="0"/>
+          <w:sz w:val="24"/>
+          <w:szCs w:val="24"/>
+          <w:lang w:val="pt-BR"/>
+        </w:rPr>
+        <w:t xml:space="preserve">sockets</w:t>
+      </w:r>
+      <w:r>
+        <w:rPr>
+          <w:rFonts w:ascii="Aptos" w:hAnsi="Aptos" w:eastAsia="Aptos" w:cs="Aptos"/>
+          <w:noProof w:val="0"/>
+          <w:sz w:val="24"/>
+          <w:szCs w:val="24"/>
+          <w:lang w:val="pt-BR"/>
+        </w:rPr>
+        <w:t xml:space="preserve">, que se tornou a forma padrão de programar comunicação entre máquinas, além de memória virtual paginada por demanda, o editor vi e o C shell.</w:t>
+      </w:r>
+    </w:p>
+    <w:p>
+      <w:pPr>
+        <w:spacing w:before="0" w:beforeAutospacing="off" w:after="240" w:afterAutospacing="off"/>
+      </w:pPr>
+      <w:r>
+        <w:rPr>
+          <w:rFonts w:ascii="Aptos" w:hAnsi="Aptos" w:eastAsia="Aptos" w:cs="Aptos"/>
+          <w:b w:val="1"/>
+          <w:bCs w:val="1"/>
+          <w:noProof w:val="0"/>
+          <w:sz w:val="24"/>
+          <w:szCs w:val="24"/>
+          <w:lang w:val="pt-BR"/>
+        </w:rPr>
+        <w:t xml:space="preserve">Recursos: </w:t>
+      </w:r>
+      <w:r>
+        <w:rPr>
+          <w:rFonts w:ascii="Aptos" w:hAnsi="Aptos" w:eastAsia="Aptos" w:cs="Aptos"/>
+          <w:i w:val="1"/>
+          <w:iCs w:val="1"/>
+          <w:noProof w:val="0"/>
+          <w:sz w:val="24"/>
+          <w:szCs w:val="24"/>
+          <w:lang w:val="pt-BR"/>
+        </w:rPr>
+        <w:t xml:space="preserve">Rede, Memória virtual</w:t>
       </w:r>
     </w:p>
     <w:p>
@@ -390,6 +673,35 @@
     </w:p>
     <w:p>
       <w:pPr>
+        <w:spacing w:before="0" w:beforeAutospacing="off" w:after="240" w:afterAutospacing="off"/>
+      </w:pPr>
+      <w:r>
+        <w:rPr>
+          <w:rFonts w:ascii="Aptos" w:hAnsi="Aptos" w:eastAsia="Aptos" w:cs="Aptos"/>
+          <w:b w:val="1"/>
+          <w:bCs w:val="1"/>
+          <w:noProof w:val="0"/>
+          <w:sz w:val="24"/>
+          <w:szCs w:val="24"/>
+          <w:lang w:val="pt-BR"/>
+        </w:rPr>
+        <w:t xml:space="preserve">Recursos: </w:t>
+      </w:r>
+      <w:r>
+        <w:rPr>
+          <w:rFonts w:ascii="Aptos" w:hAnsi="Aptos" w:eastAsia="Aptos" w:cs="Aptos"/>
+          <w:i w:val="1"/>
+          <w:iCs w:val="1"/>
+          <w:noProof w:val="0"/>
+          <w:sz w:val="24"/>
+          <w:szCs w:val="24"/>
+          <w:lang w:val="pt-BR"/>
+        </w:rPr>
+        <w:t xml:space="preserve">Memória virtual, Tempo compartilhado, Processamento em lote</w:t>
+      </w:r>
+    </w:p>
+    <w:p>
+      <w:pPr>
         <w:spacing w:before="240" w:beforeAutospacing="off" w:after="240" w:afterAutospacing="off"/>
       </w:pPr>
       <w:r>
@@ -422,6 +734,35 @@
     </w:p>
     <w:p>
       <w:pPr>
+        <w:spacing w:before="0" w:beforeAutospacing="off" w:after="240" w:afterAutospacing="off"/>
+      </w:pPr>
+      <w:r>
+        <w:rPr>
+          <w:rFonts w:ascii="Aptos" w:hAnsi="Aptos" w:eastAsia="Aptos" w:cs="Aptos"/>
+          <w:b w:val="1"/>
+          <w:bCs w:val="1"/>
+          <w:noProof w:val="0"/>
+          <w:sz w:val="24"/>
+          <w:szCs w:val="24"/>
+          <w:lang w:val="pt-BR"/>
+        </w:rPr>
+        <w:t xml:space="preserve">Recursos: </w:t>
+      </w:r>
+      <w:r>
+        <w:rPr>
+          <w:rFonts w:ascii="Aptos" w:hAnsi="Aptos" w:eastAsia="Aptos" w:cs="Aptos"/>
+          <w:i w:val="1"/>
+          <w:iCs w:val="1"/>
+          <w:noProof w:val="0"/>
+          <w:sz w:val="24"/>
+          <w:szCs w:val="24"/>
+          <w:lang w:val="pt-BR"/>
+        </w:rPr>
+        <w:t xml:space="preserve">Linha de comando, Arquivos hierárquicos</w:t>
+      </w:r>
+    </w:p>
+    <w:p>
+      <w:pPr>
         <w:spacing w:before="240" w:beforeAutospacing="off" w:after="240" w:afterAutospacing="off"/>
       </w:pPr>
       <w:r>
@@ -449,7 +790,7 @@
           <w:szCs w:val="24"/>
           <w:lang w:val="pt-BR"/>
         </w:rPr>
-        <w:t xml:space="preserve">Richard Stallman anuncia o Projeto GNU, com o objetivo de construir um sistema operacional completo e livre, compatível com o UNIX. O projeto produziu o compilador, o </w:t>
+        <w:t xml:space="preserve">Richard Stallman inicia o Projeto GNU para construir um sistema operacional completo e livre, compatível com o UNIX. O projeto entregou o compilador C, o </w:t>
       </w:r>
       <w:r>
         <w:rPr>
@@ -471,7 +812,36 @@
           <w:szCs w:val="24"/>
           <w:lang w:val="pt-BR"/>
         </w:rPr>
-        <w:t xml:space="preserve"> e as ferramentas essenciais, mas ainda não tinha um núcleo em funcionamento quando o Linux surgiu.</w:t>
+        <w:t xml:space="preserve"> e as ferramentas essenciais do ambiente, escritos para rodar em arquiteturas diferentes. Faltava-lhe um núcleo em funcionamento, papel que o Linux ocuparia em 1991.</w:t>
+      </w:r>
+    </w:p>
+    <w:p>
+      <w:pPr>
+        <w:spacing w:before="0" w:beforeAutospacing="off" w:after="240" w:afterAutospacing="off"/>
+      </w:pPr>
+      <w:r>
+        <w:rPr>
+          <w:rFonts w:ascii="Aptos" w:hAnsi="Aptos" w:eastAsia="Aptos" w:cs="Aptos"/>
+          <w:b w:val="1"/>
+          <w:bCs w:val="1"/>
+          <w:noProof w:val="0"/>
+          <w:sz w:val="24"/>
+          <w:szCs w:val="24"/>
+          <w:lang w:val="pt-BR"/>
+        </w:rPr>
+        <w:t xml:space="preserve">Recursos: </w:t>
+      </w:r>
+      <w:r>
+        <w:rPr>
+          <w:rFonts w:ascii="Aptos" w:hAnsi="Aptos" w:eastAsia="Aptos" w:cs="Aptos"/>
+          <w:i w:val="1"/>
+          <w:iCs w:val="1"/>
+          <w:noProof w:val="0"/>
+          <w:sz w:val="24"/>
+          <w:szCs w:val="24"/>
+          <w:lang w:val="pt-BR"/>
+        </w:rPr>
+        <w:t xml:space="preserve">Portabilidade, Linha de comando</w:t>
       </w:r>
     </w:p>
     <w:p>
@@ -508,6 +878,35 @@
     </w:p>
     <w:p>
       <w:pPr>
+        <w:spacing w:before="0" w:beforeAutospacing="off" w:after="240" w:afterAutospacing="off"/>
+      </w:pPr>
+      <w:r>
+        <w:rPr>
+          <w:rFonts w:ascii="Aptos" w:hAnsi="Aptos" w:eastAsia="Aptos" w:cs="Aptos"/>
+          <w:b w:val="1"/>
+          <w:bCs w:val="1"/>
+          <w:noProof w:val="0"/>
+          <w:sz w:val="24"/>
+          <w:szCs w:val="24"/>
+          <w:lang w:val="pt-BR"/>
+        </w:rPr>
+        <w:t xml:space="preserve">Recursos: </w:t>
+      </w:r>
+      <w:r>
+        <w:rPr>
+          <w:rFonts w:ascii="Aptos" w:hAnsi="Aptos" w:eastAsia="Aptos" w:cs="Aptos"/>
+          <w:i w:val="1"/>
+          <w:iCs w:val="1"/>
+          <w:noProof w:val="0"/>
+          <w:sz w:val="24"/>
+          <w:szCs w:val="24"/>
+          <w:lang w:val="pt-BR"/>
+        </w:rPr>
+        <w:t xml:space="preserve">Interface gráfica</w:t>
+      </w:r>
+    </w:p>
+    <w:p>
+      <w:pPr>
         <w:spacing w:before="240" w:beforeAutospacing="off" w:after="240" w:afterAutospacing="off"/>
       </w:pPr>
       <w:r>
@@ -540,6 +939,35 @@
     </w:p>
     <w:p>
       <w:pPr>
+        <w:spacing w:before="0" w:beforeAutospacing="off" w:after="240" w:afterAutospacing="off"/>
+      </w:pPr>
+      <w:r>
+        <w:rPr>
+          <w:rFonts w:ascii="Aptos" w:hAnsi="Aptos" w:eastAsia="Aptos" w:cs="Aptos"/>
+          <w:b w:val="1"/>
+          <w:bCs w:val="1"/>
+          <w:noProof w:val="0"/>
+          <w:sz w:val="24"/>
+          <w:szCs w:val="24"/>
+          <w:lang w:val="pt-BR"/>
+        </w:rPr>
+        <w:t xml:space="preserve">Recursos: </w:t>
+      </w:r>
+      <w:r>
+        <w:rPr>
+          <w:rFonts w:ascii="Aptos" w:hAnsi="Aptos" w:eastAsia="Aptos" w:cs="Aptos"/>
+          <w:i w:val="1"/>
+          <w:iCs w:val="1"/>
+          <w:noProof w:val="0"/>
+          <w:sz w:val="24"/>
+          <w:szCs w:val="24"/>
+          <w:lang w:val="pt-BR"/>
+        </w:rPr>
+        <w:t xml:space="preserve">Interface gráfica</w:t>
+      </w:r>
+    </w:p>
+    <w:p>
+      <w:pPr>
         <w:spacing w:before="240" w:beforeAutospacing="off" w:after="240" w:afterAutospacing="off"/>
       </w:pPr>
       <w:r>
@@ -567,7 +995,58 @@
           <w:szCs w:val="24"/>
           <w:lang w:val="pt-BR"/>
         </w:rPr>
-        <w:t xml:space="preserve">Andrew Tanenbaum publica o Minix, um sistema operacional pequeno e de código legível, criado para o ensino. Foi o ambiente que Linus Torvalds utilizava e cujas limitações motivaram o início do Linux.</w:t>
+        <w:t xml:space="preserve">Andrew Tanenbaum publica o Minix, construído sobre uma arquitetura de </w:t>
+      </w:r>
+      <w:r>
+        <w:rPr>
+          <w:rFonts w:ascii="Aptos" w:hAnsi="Aptos" w:eastAsia="Aptos" w:cs="Aptos"/>
+          <w:i w:val="1"/>
+          <w:iCs w:val="1"/>
+          <w:noProof w:val="0"/>
+          <w:sz w:val="24"/>
+          <w:szCs w:val="24"/>
+          <w:lang w:val="pt-BR"/>
+        </w:rPr>
+        <w:t xml:space="preserve">microkernel</w:t>
+      </w:r>
+      <w:r>
+        <w:rPr>
+          <w:rFonts w:ascii="Aptos" w:hAnsi="Aptos" w:eastAsia="Aptos" w:cs="Aptos"/>
+          <w:noProof w:val="0"/>
+          <w:sz w:val="24"/>
+          <w:szCs w:val="24"/>
+          <w:lang w:val="pt-BR"/>
+        </w:rPr>
+        <w:t xml:space="preserve">: apenas o essencial roda em modo privilegiado, e serviços como o sistema de arquivos e os drivers de dispositivo executam como processos separados, de modo que a falha de um não derruba o sistema inteiro. Foi o ambiente que Linus Torvalds utilizava antes de iniciar o Linux.</w:t>
+      </w:r>
+    </w:p>
+    <w:p>
+      <w:pPr>
+        <w:spacing w:before="0" w:beforeAutospacing="off" w:after="240" w:afterAutospacing="off"/>
+      </w:pPr>
+      <w:r>
+        <w:rPr>
+          <w:rFonts w:ascii="Aptos" w:hAnsi="Aptos" w:eastAsia="Aptos" w:cs="Aptos"/>
+          <w:b w:val="1"/>
+          <w:bCs w:val="1"/>
+          <w:noProof w:val="0"/>
+          <w:sz w:val="24"/>
+          <w:szCs w:val="24"/>
+          <w:lang w:val="pt-BR"/>
+        </w:rPr>
+        <w:t xml:space="preserve">Recursos: </w:t>
+      </w:r>
+      <w:r>
+        <w:rPr>
+          <w:rFonts w:ascii="Aptos" w:hAnsi="Aptos" w:eastAsia="Aptos" w:cs="Aptos"/>
+          <w:i w:val="1"/>
+          <w:iCs w:val="1"/>
+          <w:noProof w:val="0"/>
+          <w:sz w:val="24"/>
+          <w:szCs w:val="24"/>
+          <w:lang w:val="pt-BR"/>
+        </w:rPr>
+        <w:t xml:space="preserve">Proteção de memória</w:t>
       </w:r>
     </w:p>
     <w:p>
@@ -604,6 +1083,35 @@
     </w:p>
     <w:p>
       <w:pPr>
+        <w:spacing w:before="0" w:beforeAutospacing="off" w:after="240" w:afterAutospacing="off"/>
+      </w:pPr>
+      <w:r>
+        <w:rPr>
+          <w:rFonts w:ascii="Aptos" w:hAnsi="Aptos" w:eastAsia="Aptos" w:cs="Aptos"/>
+          <w:b w:val="1"/>
+          <w:bCs w:val="1"/>
+          <w:noProof w:val="0"/>
+          <w:sz w:val="24"/>
+          <w:szCs w:val="24"/>
+          <w:lang w:val="pt-BR"/>
+        </w:rPr>
+        <w:t xml:space="preserve">Recursos: </w:t>
+      </w:r>
+      <w:r>
+        <w:rPr>
+          <w:rFonts w:ascii="Aptos" w:hAnsi="Aptos" w:eastAsia="Aptos" w:cs="Aptos"/>
+          <w:i w:val="1"/>
+          <w:iCs w:val="1"/>
+          <w:noProof w:val="0"/>
+          <w:sz w:val="24"/>
+          <w:szCs w:val="24"/>
+          <w:lang w:val="pt-BR"/>
+        </w:rPr>
+        <w:t xml:space="preserve">Interface gráfica, Memória virtual</w:t>
+      </w:r>
+    </w:p>
+    <w:p>
+      <w:pPr>
         <w:spacing w:before="240" w:beforeAutospacing="off" w:after="240" w:afterAutospacing="off"/>
       </w:pPr>
       <w:r>
@@ -631,7 +1139,36 @@
           <w:szCs w:val="24"/>
           <w:lang w:val="pt-BR"/>
         </w:rPr>
-        <w:t xml:space="preserve">Linus Torvalds inicia o desenvolvimento do Linux. O projeto se destaca pelo modelo de software livre e código aberto, permitindo que seu código fosse estudado, modificado e distribuído.</w:t>
+        <w:t xml:space="preserve">Linus Torvalds inicia o desenvolvimento do núcleo Linux, com multitarefa preemptiva, memória protegida entre processos e módulos de kernel que podem ser carregados e descarregados com o sistema em execução. O código aberto permitiu que fosse adaptado a arquiteturas muito diferentes, de supercomputadores a telefones celulares.</w:t>
+      </w:r>
+    </w:p>
+    <w:p>
+      <w:pPr>
+        <w:spacing w:before="0" w:beforeAutospacing="off" w:after="240" w:afterAutospacing="off"/>
+      </w:pPr>
+      <w:r>
+        <w:rPr>
+          <w:rFonts w:ascii="Aptos" w:hAnsi="Aptos" w:eastAsia="Aptos" w:cs="Aptos"/>
+          <w:b w:val="1"/>
+          <w:bCs w:val="1"/>
+          <w:noProof w:val="0"/>
+          <w:sz w:val="24"/>
+          <w:szCs w:val="24"/>
+          <w:lang w:val="pt-BR"/>
+        </w:rPr>
+        <w:t xml:space="preserve">Recursos: </w:t>
+      </w:r>
+      <w:r>
+        <w:rPr>
+          <w:rFonts w:ascii="Aptos" w:hAnsi="Aptos" w:eastAsia="Aptos" w:cs="Aptos"/>
+          <w:i w:val="1"/>
+          <w:iCs w:val="1"/>
+          <w:noProof w:val="0"/>
+          <w:sz w:val="24"/>
+          <w:szCs w:val="24"/>
+          <w:lang w:val="pt-BR"/>
+        </w:rPr>
+        <w:t xml:space="preserve">Multiprogramação, Portabilidade, Proteção de memória</w:t>
       </w:r>
     </w:p>
     <w:p>
@@ -668,6 +1205,35 @@
     </w:p>
     <w:p>
       <w:pPr>
+        <w:spacing w:before="0" w:beforeAutospacing="off" w:after="240" w:afterAutospacing="off"/>
+      </w:pPr>
+      <w:r>
+        <w:rPr>
+          <w:rFonts w:ascii="Aptos" w:hAnsi="Aptos" w:eastAsia="Aptos" w:cs="Aptos"/>
+          <w:b w:val="1"/>
+          <w:bCs w:val="1"/>
+          <w:noProof w:val="0"/>
+          <w:sz w:val="24"/>
+          <w:szCs w:val="24"/>
+          <w:lang w:val="pt-BR"/>
+        </w:rPr>
+        <w:t xml:space="preserve">Recursos: </w:t>
+      </w:r>
+      <w:r>
+        <w:rPr>
+          <w:rFonts w:ascii="Aptos" w:hAnsi="Aptos" w:eastAsia="Aptos" w:cs="Aptos"/>
+          <w:i w:val="1"/>
+          <w:iCs w:val="1"/>
+          <w:noProof w:val="0"/>
+          <w:sz w:val="24"/>
+          <w:szCs w:val="24"/>
+          <w:lang w:val="pt-BR"/>
+        </w:rPr>
+        <w:t xml:space="preserve">Proteção de memória, Multiprogramação, Rede, Memória virtual</w:t>
+      </w:r>
+    </w:p>
+    <w:p>
+      <w:pPr>
         <w:spacing w:before="240" w:beforeAutospacing="off" w:after="240" w:afterAutospacing="off"/>
       </w:pPr>
       <w:r>
@@ -722,6 +1288,35 @@
     </w:p>
     <w:p>
       <w:pPr>
+        <w:spacing w:before="0" w:beforeAutospacing="off" w:after="240" w:afterAutospacing="off"/>
+      </w:pPr>
+      <w:r>
+        <w:rPr>
+          <w:rFonts w:ascii="Aptos" w:hAnsi="Aptos" w:eastAsia="Aptos" w:cs="Aptos"/>
+          <w:b w:val="1"/>
+          <w:bCs w:val="1"/>
+          <w:noProof w:val="0"/>
+          <w:sz w:val="24"/>
+          <w:szCs w:val="24"/>
+          <w:lang w:val="pt-BR"/>
+        </w:rPr>
+        <w:t xml:space="preserve">Recursos: </w:t>
+      </w:r>
+      <w:r>
+        <w:rPr>
+          <w:rFonts w:ascii="Aptos" w:hAnsi="Aptos" w:eastAsia="Aptos" w:cs="Aptos"/>
+          <w:i w:val="1"/>
+          <w:iCs w:val="1"/>
+          <w:noProof w:val="0"/>
+          <w:sz w:val="24"/>
+          <w:szCs w:val="24"/>
+          <w:lang w:val="pt-BR"/>
+        </w:rPr>
+        <w:t xml:space="preserve">Interface gráfica, Detecção de hardware, Multiprogramação</w:t>
+      </w:r>
+    </w:p>
+    <w:p>
+      <w:pPr>
         <w:spacing w:before="240" w:beforeAutospacing="off" w:after="240" w:afterAutospacing="off"/>
       </w:pPr>
       <w:r>
@@ -754,6 +1349,35 @@
     </w:p>
     <w:p>
       <w:pPr>
+        <w:spacing w:before="0" w:beforeAutospacing="off" w:after="240" w:afterAutospacing="off"/>
+      </w:pPr>
+      <w:r>
+        <w:rPr>
+          <w:rFonts w:ascii="Aptos" w:hAnsi="Aptos" w:eastAsia="Aptos" w:cs="Aptos"/>
+          <w:b w:val="1"/>
+          <w:bCs w:val="1"/>
+          <w:noProof w:val="0"/>
+          <w:sz w:val="24"/>
+          <w:szCs w:val="24"/>
+          <w:lang w:val="pt-BR"/>
+        </w:rPr>
+        <w:t xml:space="preserve">Recursos: </w:t>
+      </w:r>
+      <w:r>
+        <w:rPr>
+          <w:rFonts w:ascii="Aptos" w:hAnsi="Aptos" w:eastAsia="Aptos" w:cs="Aptos"/>
+          <w:i w:val="1"/>
+          <w:iCs w:val="1"/>
+          <w:noProof w:val="0"/>
+          <w:sz w:val="24"/>
+          <w:szCs w:val="24"/>
+          <w:lang w:val="pt-BR"/>
+        </w:rPr>
+        <w:t xml:space="preserve">Interface gráfica, Rede, Proteção de memória, Detecção de hardware</w:t>
+      </w:r>
+    </w:p>
+    <w:p>
+      <w:pPr>
         <w:spacing w:before="240" w:beforeAutospacing="off" w:after="240" w:afterAutospacing="off"/>
       </w:pPr>
       <w:r>
@@ -786,6 +1410,35 @@
     </w:p>
     <w:p>
       <w:pPr>
+        <w:spacing w:before="0" w:beforeAutospacing="off" w:after="240" w:afterAutospacing="off"/>
+      </w:pPr>
+      <w:r>
+        <w:rPr>
+          <w:rFonts w:ascii="Aptos" w:hAnsi="Aptos" w:eastAsia="Aptos" w:cs="Aptos"/>
+          <w:b w:val="1"/>
+          <w:bCs w:val="1"/>
+          <w:noProof w:val="0"/>
+          <w:sz w:val="24"/>
+          <w:szCs w:val="24"/>
+          <w:lang w:val="pt-BR"/>
+        </w:rPr>
+        <w:t xml:space="preserve">Recursos: </w:t>
+      </w:r>
+      <w:r>
+        <w:rPr>
+          <w:rFonts w:ascii="Aptos" w:hAnsi="Aptos" w:eastAsia="Aptos" w:cs="Aptos"/>
+          <w:i w:val="1"/>
+          <w:iCs w:val="1"/>
+          <w:noProof w:val="0"/>
+          <w:sz w:val="24"/>
+          <w:szCs w:val="24"/>
+          <w:lang w:val="pt-BR"/>
+        </w:rPr>
+        <w:t xml:space="preserve">Proteção de memória, Multiprogramação, Memória virtual, Interface gráfica</w:t>
+      </w:r>
+    </w:p>
+    <w:p>
+      <w:pPr>
         <w:spacing w:before="240" w:beforeAutospacing="off" w:after="240" w:afterAutospacing="off"/>
       </w:pPr>
       <w:r>
@@ -818,6 +1471,35 @@
     </w:p>
     <w:p>
       <w:pPr>
+        <w:spacing w:before="0" w:beforeAutospacing="off" w:after="240" w:afterAutospacing="off"/>
+      </w:pPr>
+      <w:r>
+        <w:rPr>
+          <w:rFonts w:ascii="Aptos" w:hAnsi="Aptos" w:eastAsia="Aptos" w:cs="Aptos"/>
+          <w:b w:val="1"/>
+          <w:bCs w:val="1"/>
+          <w:noProof w:val="0"/>
+          <w:sz w:val="24"/>
+          <w:szCs w:val="24"/>
+          <w:lang w:val="pt-BR"/>
+        </w:rPr>
+        <w:t xml:space="preserve">Recursos: </w:t>
+      </w:r>
+      <w:r>
+        <w:rPr>
+          <w:rFonts w:ascii="Aptos" w:hAnsi="Aptos" w:eastAsia="Aptos" w:cs="Aptos"/>
+          <w:i w:val="1"/>
+          <w:iCs w:val="1"/>
+          <w:noProof w:val="0"/>
+          <w:sz w:val="24"/>
+          <w:szCs w:val="24"/>
+          <w:lang w:val="pt-BR"/>
+        </w:rPr>
+        <w:t xml:space="preserve">Interface por toque</w:t>
+      </w:r>
+    </w:p>
+    <w:p>
+      <w:pPr>
         <w:spacing w:before="240" w:beforeAutospacing="off" w:after="240" w:afterAutospacing="off"/>
       </w:pPr>
       <w:r>
@@ -850,6 +1532,35 @@
     </w:p>
     <w:p>
       <w:pPr>
+        <w:spacing w:before="0" w:beforeAutospacing="off" w:after="240" w:afterAutospacing="off"/>
+      </w:pPr>
+      <w:r>
+        <w:rPr>
+          <w:rFonts w:ascii="Aptos" w:hAnsi="Aptos" w:eastAsia="Aptos" w:cs="Aptos"/>
+          <w:b w:val="1"/>
+          <w:bCs w:val="1"/>
+          <w:noProof w:val="0"/>
+          <w:sz w:val="24"/>
+          <w:szCs w:val="24"/>
+          <w:lang w:val="pt-BR"/>
+        </w:rPr>
+        <w:t xml:space="preserve">Recursos: </w:t>
+      </w:r>
+      <w:r>
+        <w:rPr>
+          <w:rFonts w:ascii="Aptos" w:hAnsi="Aptos" w:eastAsia="Aptos" w:cs="Aptos"/>
+          <w:i w:val="1"/>
+          <w:iCs w:val="1"/>
+          <w:noProof w:val="0"/>
+          <w:sz w:val="24"/>
+          <w:szCs w:val="24"/>
+          <w:lang w:val="pt-BR"/>
+        </w:rPr>
+        <w:t xml:space="preserve">Interface por toque, Isolamento de aplicações</w:t>
+      </w:r>
+    </w:p>
+    <w:p>
+      <w:pPr>
         <w:spacing w:before="240" w:beforeAutospacing="off" w:after="240" w:afterAutospacing="off"/>
       </w:pPr>
       <w:r>
@@ -882,6 +1593,35 @@
     </w:p>
     <w:p>
       <w:pPr>
+        <w:spacing w:before="0" w:beforeAutospacing="off" w:after="240" w:afterAutospacing="off"/>
+      </w:pPr>
+      <w:r>
+        <w:rPr>
+          <w:rFonts w:ascii="Aptos" w:hAnsi="Aptos" w:eastAsia="Aptos" w:cs="Aptos"/>
+          <w:b w:val="1"/>
+          <w:bCs w:val="1"/>
+          <w:noProof w:val="0"/>
+          <w:sz w:val="24"/>
+          <w:szCs w:val="24"/>
+          <w:lang w:val="pt-BR"/>
+        </w:rPr>
+        <w:t xml:space="preserve">Recursos: </w:t>
+      </w:r>
+      <w:r>
+        <w:rPr>
+          <w:rFonts w:ascii="Aptos" w:hAnsi="Aptos" w:eastAsia="Aptos" w:cs="Aptos"/>
+          <w:i w:val="1"/>
+          <w:iCs w:val="1"/>
+          <w:noProof w:val="0"/>
+          <w:sz w:val="24"/>
+          <w:szCs w:val="24"/>
+          <w:lang w:val="pt-BR"/>
+        </w:rPr>
+        <w:t xml:space="preserve">Computação em nuvem, Isolamento de aplicações</w:t>
+      </w:r>
+    </w:p>
+    <w:p>
+      <w:pPr>
         <w:spacing w:before="240" w:beforeAutospacing="off" w:after="240" w:afterAutospacing="off"/>
       </w:pPr>
       <w:r>
@@ -958,6 +1698,35 @@
     </w:p>
     <w:p>
       <w:pPr>
+        <w:spacing w:before="0" w:beforeAutospacing="off" w:after="240" w:afterAutospacing="off"/>
+      </w:pPr>
+      <w:r>
+        <w:rPr>
+          <w:rFonts w:ascii="Aptos" w:hAnsi="Aptos" w:eastAsia="Aptos" w:cs="Aptos"/>
+          <w:b w:val="1"/>
+          <w:bCs w:val="1"/>
+          <w:noProof w:val="0"/>
+          <w:sz w:val="24"/>
+          <w:szCs w:val="24"/>
+          <w:lang w:val="pt-BR"/>
+        </w:rPr>
+        <w:t xml:space="preserve">Recursos: </w:t>
+      </w:r>
+      <w:r>
+        <w:rPr>
+          <w:rFonts w:ascii="Aptos" w:hAnsi="Aptos" w:eastAsia="Aptos" w:cs="Aptos"/>
+          <w:i w:val="1"/>
+          <w:iCs w:val="1"/>
+          <w:noProof w:val="0"/>
+          <w:sz w:val="24"/>
+          <w:szCs w:val="24"/>
+          <w:lang w:val="pt-BR"/>
+        </w:rPr>
+        <w:t xml:space="preserve">Isolamento de aplicações</w:t>
+      </w:r>
+    </w:p>
+    <w:p>
+      <w:pPr>
         <w:spacing w:before="240" w:beforeAutospacing="off" w:after="240" w:afterAutospacing="off"/>
       </w:pPr>
       <w:r>
@@ -990,6 +1759,35 @@
     </w:p>
     <w:p>
       <w:pPr>
+        <w:spacing w:before="0" w:beforeAutospacing="off" w:after="240" w:afterAutospacing="off"/>
+      </w:pPr>
+      <w:r>
+        <w:rPr>
+          <w:rFonts w:ascii="Aptos" w:hAnsi="Aptos" w:eastAsia="Aptos" w:cs="Aptos"/>
+          <w:b w:val="1"/>
+          <w:bCs w:val="1"/>
+          <w:noProof w:val="0"/>
+          <w:sz w:val="24"/>
+          <w:szCs w:val="24"/>
+          <w:lang w:val="pt-BR"/>
+        </w:rPr>
+        <w:t xml:space="preserve">Recursos: </w:t>
+      </w:r>
+      <w:r>
+        <w:rPr>
+          <w:rFonts w:ascii="Aptos" w:hAnsi="Aptos" w:eastAsia="Aptos" w:cs="Aptos"/>
+          <w:i w:val="1"/>
+          <w:iCs w:val="1"/>
+          <w:noProof w:val="0"/>
+          <w:sz w:val="24"/>
+          <w:szCs w:val="24"/>
+          <w:lang w:val="pt-BR"/>
+        </w:rPr>
+        <w:t xml:space="preserve">Computação em nuvem</w:t>
+      </w:r>
+    </w:p>
+    <w:p>
+      <w:pPr>
         <w:spacing w:before="240" w:beforeAutospacing="off" w:after="240" w:afterAutospacing="off"/>
       </w:pPr>
       <w:r>
@@ -1022,6 +1820,35 @@
     </w:p>
     <w:p>
       <w:pPr>
+        <w:spacing w:before="0" w:beforeAutospacing="off" w:after="240" w:afterAutospacing="off"/>
+      </w:pPr>
+      <w:r>
+        <w:rPr>
+          <w:rFonts w:ascii="Aptos" w:hAnsi="Aptos" w:eastAsia="Aptos" w:cs="Aptos"/>
+          <w:b w:val="1"/>
+          <w:bCs w:val="1"/>
+          <w:noProof w:val="0"/>
+          <w:sz w:val="24"/>
+          <w:szCs w:val="24"/>
+          <w:lang w:val="pt-BR"/>
+        </w:rPr>
+        <w:t xml:space="preserve">Recursos: </w:t>
+      </w:r>
+      <w:r>
+        <w:rPr>
+          <w:rFonts w:ascii="Aptos" w:hAnsi="Aptos" w:eastAsia="Aptos" w:cs="Aptos"/>
+          <w:i w:val="1"/>
+          <w:iCs w:val="1"/>
+          <w:noProof w:val="0"/>
+          <w:sz w:val="24"/>
+          <w:szCs w:val="24"/>
+          <w:lang w:val="pt-BR"/>
+        </w:rPr>
+        <w:t xml:space="preserve">Inteligência artificial</w:t>
+      </w:r>
+    </w:p>
+    <w:p>
+      <w:pPr>
         <w:spacing w:before="240" w:beforeAutospacing="off" w:after="240" w:afterAutospacing="off"/>
       </w:pPr>
       <w:r>
@@ -1050,6 +1877,35 @@
           <w:lang w:val="pt-BR"/>
         </w:rPr>
         <w:t xml:space="preserve">A evolução atual combina inteligência artificial, computação em nuvem, segurança avançada, virtualização e integração entre diferentes dispositivos. Os sistemas operacionais passam a atuar não apenas como gerenciadores de hardware e software, mas também como plataformas integradas de serviços e recursos inteligentes.</w:t>
+      </w:r>
+    </w:p>
+    <w:p>
+      <w:pPr>
+        <w:spacing w:before="0" w:beforeAutospacing="off" w:after="240" w:afterAutospacing="off"/>
+      </w:pPr>
+      <w:r>
+        <w:rPr>
+          <w:rFonts w:ascii="Aptos" w:hAnsi="Aptos" w:eastAsia="Aptos" w:cs="Aptos"/>
+          <w:b w:val="1"/>
+          <w:bCs w:val="1"/>
+          <w:noProof w:val="0"/>
+          <w:sz w:val="24"/>
+          <w:szCs w:val="24"/>
+          <w:lang w:val="pt-BR"/>
+        </w:rPr>
+        <w:t xml:space="preserve">Recursos: </w:t>
+      </w:r>
+      <w:r>
+        <w:rPr>
+          <w:rFonts w:ascii="Aptos" w:hAnsi="Aptos" w:eastAsia="Aptos" w:cs="Aptos"/>
+          <w:i w:val="1"/>
+          <w:iCs w:val="1"/>
+          <w:noProof w:val="0"/>
+          <w:sz w:val="24"/>
+          <w:szCs w:val="24"/>
+          <w:lang w:val="pt-BR"/>
+        </w:rPr>
+        <w:t xml:space="preserve">Inteligência artificial, Computação em nuvem, Isolamento de aplicações</w:t>
       </w:r>
     </w:p>
     <w:p/>

</xml_diff>